<commit_message>
M3 Team 5 Assignments Summary Updated
</commit_message>
<xml_diff>
--- a/01_Standards/Templates/Milestone_3_Components/M3_Team5_Assignments_Summary.docx
+++ b/01_Standards/Templates/Milestone_3_Components/M3_Team5_Assignments_Summary.docx
@@ -516,6 +516,37 @@
       <w:r>
         <w:t>External Services Orchestrator</w:t>
       </w:r>
+      <w:r>
+        <w:t xml:space="preserve"> </w:t>
+      </w:r>
+      <w:r>
+        <w:t>–</w:t>
+      </w:r>
+      <w:r>
+        <w:t xml:space="preserve"> </w:t>
+      </w:r>
+      <w:r>
+        <w:rPr>
+          <w:b/>
+          <w:bCs/>
+        </w:rPr>
+        <w:t>Adam</w:t>
+      </w:r>
+      <w:r>
+        <w:rPr>
+          <w:b/>
+          <w:bCs/>
+        </w:rPr>
+        <w:t xml:space="preserve"> – </w:t>
+      </w:r>
+      <w:r>
+        <w:rPr>
+          <w:b/>
+          <w:bCs/>
+          <w:color w:val="EE0000"/>
+        </w:rPr>
+        <w:t>Reviewed by Ethan S.</w:t>
+      </w:r>
     </w:p>
     <w:p>
       <w:pPr>
@@ -549,6 +580,68 @@
       <w:r>
         <w:t>Analytics Orchestrator</w:t>
       </w:r>
+      <w:r>
+        <w:t xml:space="preserve"> </w:t>
+      </w:r>
+      <w:r>
+        <w:t>–</w:t>
+      </w:r>
+      <w:r>
+        <w:t xml:space="preserve"> </w:t>
+      </w:r>
+      <w:r>
+        <w:rPr>
+          <w:b/>
+          <w:bCs/>
+        </w:rPr>
+        <w:t>Wesley</w:t>
+      </w:r>
+      <w:r>
+        <w:rPr>
+          <w:b/>
+          <w:bCs/>
+        </w:rPr>
+        <w:t xml:space="preserve"> </w:t>
+      </w:r>
+      <w:r>
+        <w:rPr>
+          <w:b/>
+          <w:bCs/>
+        </w:rPr>
+        <w:t xml:space="preserve">– </w:t>
+      </w:r>
+      <w:r>
+        <w:rPr>
+          <w:b/>
+          <w:bCs/>
+          <w:color w:val="EE0000"/>
+        </w:rPr>
+        <w:t>Review</w:t>
+      </w:r>
+      <w:r>
+        <w:rPr>
+          <w:b/>
+          <w:bCs/>
+          <w:color w:val="EE0000"/>
+        </w:rPr>
+        <w:t>ed</w:t>
+      </w:r>
+      <w:r>
+        <w:rPr>
+          <w:b/>
+          <w:bCs/>
+          <w:color w:val="EE0000"/>
+        </w:rPr>
+        <w:t xml:space="preserve"> by</w:t>
+      </w:r>
+      <w:r>
+        <w:rPr>
+          <w:b/>
+          <w:bCs/>
+          <w:color w:val="EE0000"/>
+        </w:rPr>
+        <w:t xml:space="preserve"> William</w:t>
+      </w:r>
     </w:p>
     <w:p>
       <w:pPr>
@@ -598,23 +691,59 @@
         </w:numPr>
       </w:pPr>
       <w:r>
-        <w:rPr>
-          <w:strike/>
+        <w:t xml:space="preserve">El Table 1.12.1 </w:t>
+      </w:r>
+      <w:r>
+        <w:t>— USPS Address Validation Adapter</w:t>
+      </w:r>
+      <w:r>
+        <w:t xml:space="preserve"> - </w:t>
+      </w:r>
+      <w:r>
+        <w:rPr>
+          <w:b/>
+          <w:bCs/>
+        </w:rPr>
+        <w:t>William</w:t>
+      </w:r>
+      <w:r>
+        <w:rPr>
+          <w:b/>
+          <w:bCs/>
+        </w:rPr>
+        <w:t xml:space="preserve">– </w:t>
+      </w:r>
+      <w:r>
+        <w:rPr>
+          <w:b/>
+          <w:bCs/>
           <w:color w:val="EE0000"/>
         </w:rPr>
-        <w:t>EI Table 1.11.1</w:t>
-      </w:r>
-      <w:r>
-        <w:rPr>
+        <w:t>Review</w:t>
+      </w:r>
+      <w:r>
+        <w:rPr>
+          <w:b/>
+          <w:bCs/>
           <w:color w:val="EE0000"/>
         </w:rPr>
-        <w:t xml:space="preserve"> </w:t>
-      </w:r>
-      <w:r>
-        <w:t xml:space="preserve">El Table 1.12.1 </w:t>
-      </w:r>
-      <w:r>
-        <w:t>— USPS Address Validation Adapter</w:t>
+        <w:t>ed</w:t>
+      </w:r>
+      <w:r>
+        <w:rPr>
+          <w:b/>
+          <w:bCs/>
+          <w:color w:val="EE0000"/>
+        </w:rPr>
+        <w:t xml:space="preserve"> by</w:t>
+      </w:r>
+      <w:r>
+        <w:rPr>
+          <w:b/>
+          <w:bCs/>
+          <w:color w:val="EE0000"/>
+        </w:rPr>
+        <w:t xml:space="preserve"> Adam</w:t>
       </w:r>
     </w:p>
     <w:p>
@@ -626,20 +755,59 @@
         </w:numPr>
       </w:pPr>
       <w:r>
-        <w:rPr>
-          <w:strike/>
+        <w:t xml:space="preserve">El Table 1.12.2 </w:t>
+      </w:r>
+      <w:r>
+        <w:t>— Autocomplete API Adapter</w:t>
+      </w:r>
+      <w:r>
+        <w:t xml:space="preserve"> - </w:t>
+      </w:r>
+      <w:r>
+        <w:rPr>
+          <w:b/>
+          <w:bCs/>
+        </w:rPr>
+        <w:t>Wesley</w:t>
+      </w:r>
+      <w:r>
+        <w:rPr>
+          <w:b/>
+          <w:bCs/>
+        </w:rPr>
+        <w:t xml:space="preserve">– </w:t>
+      </w:r>
+      <w:r>
+        <w:rPr>
+          <w:b/>
+          <w:bCs/>
           <w:color w:val="EE0000"/>
         </w:rPr>
-        <w:t>EI Table 1.11.2</w:t>
-      </w:r>
-      <w:r>
-        <w:t xml:space="preserve"> </w:t>
-      </w:r>
-      <w:r>
-        <w:t xml:space="preserve">El Table 1.12.2 </w:t>
-      </w:r>
-      <w:r>
-        <w:t>— Autocomplete API Adapter</w:t>
+        <w:t>Review</w:t>
+      </w:r>
+      <w:r>
+        <w:rPr>
+          <w:b/>
+          <w:bCs/>
+          <w:color w:val="EE0000"/>
+        </w:rPr>
+        <w:t>ed</w:t>
+      </w:r>
+      <w:r>
+        <w:rPr>
+          <w:b/>
+          <w:bCs/>
+          <w:color w:val="EE0000"/>
+        </w:rPr>
+        <w:t xml:space="preserve"> by</w:t>
+      </w:r>
+      <w:r>
+        <w:rPr>
+          <w:b/>
+          <w:bCs/>
+          <w:color w:val="EE0000"/>
+        </w:rPr>
+        <w:t xml:space="preserve"> William</w:t>
       </w:r>
     </w:p>
     <w:p>
@@ -651,20 +819,66 @@
         </w:numPr>
       </w:pPr>
       <w:r>
-        <w:rPr>
-          <w:strike/>
+        <w:t xml:space="preserve">El Table 1.12.3 </w:t>
+      </w:r>
+      <w:r>
+        <w:t>— Push Notification Gateway</w:t>
+      </w:r>
+      <w:r>
+        <w:t xml:space="preserve"> – </w:t>
+      </w:r>
+      <w:r>
+        <w:rPr>
+          <w:b/>
+          <w:bCs/>
+        </w:rPr>
+        <w:t>Ethan S.</w:t>
+      </w:r>
+      <w:r>
+        <w:rPr>
+          <w:b/>
+          <w:bCs/>
+        </w:rPr>
+        <w:t xml:space="preserve"> </w:t>
+      </w:r>
+      <w:r>
+        <w:rPr>
+          <w:b/>
+          <w:bCs/>
+        </w:rPr>
+        <w:t xml:space="preserve">– </w:t>
+      </w:r>
+      <w:r>
+        <w:rPr>
+          <w:b/>
+          <w:bCs/>
           <w:color w:val="EE0000"/>
         </w:rPr>
-        <w:t>EI Table 1.11.3</w:t>
-      </w:r>
-      <w:r>
-        <w:t xml:space="preserve"> </w:t>
-      </w:r>
-      <w:r>
-        <w:t xml:space="preserve">El Table 1.12.3 </w:t>
-      </w:r>
-      <w:r>
-        <w:t>— Push Notification Gateway</w:t>
+        <w:t>Review</w:t>
+      </w:r>
+      <w:r>
+        <w:rPr>
+          <w:b/>
+          <w:bCs/>
+          <w:color w:val="EE0000"/>
+        </w:rPr>
+        <w:t>ed</w:t>
+      </w:r>
+      <w:r>
+        <w:rPr>
+          <w:b/>
+          <w:bCs/>
+          <w:color w:val="EE0000"/>
+        </w:rPr>
+        <w:t xml:space="preserve"> by</w:t>
+      </w:r>
+      <w:r>
+        <w:rPr>
+          <w:b/>
+          <w:bCs/>
+          <w:color w:val="EE0000"/>
+        </w:rPr>
+        <w:t xml:space="preserve"> Dallin</w:t>
       </w:r>
     </w:p>
     <w:p>
@@ -703,20 +917,59 @@
         </w:numPr>
       </w:pPr>
       <w:r>
-        <w:rPr>
-          <w:strike/>
+        <w:t xml:space="preserve">El Table 1.13.1 </w:t>
+      </w:r>
+      <w:r>
+        <w:t>— Job Posting Analytics</w:t>
+      </w:r>
+      <w:r>
+        <w:t xml:space="preserve"> - </w:t>
+      </w:r>
+      <w:r>
+        <w:rPr>
+          <w:b/>
+          <w:bCs/>
+        </w:rPr>
+        <w:t>Dallin</w:t>
+      </w:r>
+      <w:r>
+        <w:rPr>
+          <w:b/>
+          <w:bCs/>
+        </w:rPr>
+        <w:t xml:space="preserve">– </w:t>
+      </w:r>
+      <w:r>
+        <w:rPr>
+          <w:b/>
+          <w:bCs/>
           <w:color w:val="EE0000"/>
         </w:rPr>
-        <w:t>EI Table 1.12.1</w:t>
-      </w:r>
-      <w:r>
-        <w:t xml:space="preserve"> </w:t>
-      </w:r>
-      <w:r>
-        <w:t xml:space="preserve">El Table 1.13.1 </w:t>
-      </w:r>
-      <w:r>
-        <w:t>— Job Posting Analytics</w:t>
+        <w:t>Review</w:t>
+      </w:r>
+      <w:r>
+        <w:rPr>
+          <w:b/>
+          <w:bCs/>
+          <w:color w:val="EE0000"/>
+        </w:rPr>
+        <w:t>ed</w:t>
+      </w:r>
+      <w:r>
+        <w:rPr>
+          <w:b/>
+          <w:bCs/>
+          <w:color w:val="EE0000"/>
+        </w:rPr>
+        <w:t xml:space="preserve"> by</w:t>
+      </w:r>
+      <w:r>
+        <w:rPr>
+          <w:b/>
+          <w:bCs/>
+          <w:color w:val="EE0000"/>
+        </w:rPr>
+        <w:t xml:space="preserve"> Wesley</w:t>
       </w:r>
     </w:p>
     <w:p>
@@ -728,26 +981,59 @@
         </w:numPr>
       </w:pPr>
       <w:r>
-        <w:rPr>
-          <w:strike/>
+        <w:t xml:space="preserve">El Table 1.13.2 </w:t>
+      </w:r>
+      <w:r>
+        <w:t>— Search and Candidate Analytics</w:t>
+      </w:r>
+      <w:r>
+        <w:t xml:space="preserve"> - </w:t>
+      </w:r>
+      <w:r>
+        <w:rPr>
+          <w:b/>
+          <w:bCs/>
+        </w:rPr>
+        <w:t>Dallin</w:t>
+      </w:r>
+      <w:r>
+        <w:rPr>
+          <w:b/>
+          <w:bCs/>
+        </w:rPr>
+        <w:t xml:space="preserve">– </w:t>
+      </w:r>
+      <w:r>
+        <w:rPr>
+          <w:b/>
+          <w:bCs/>
           <w:color w:val="EE0000"/>
         </w:rPr>
-        <w:t>EI Table 1.12.2</w:t>
-      </w:r>
-      <w:r>
-        <w:t xml:space="preserve"> </w:t>
-      </w:r>
-      <w:r>
-        <w:t>El Table 1.13.</w:t>
-      </w:r>
-      <w:r>
-        <w:t>2</w:t>
-      </w:r>
-      <w:r>
-        <w:t xml:space="preserve"> </w:t>
-      </w:r>
-      <w:r>
-        <w:t>— Search and Candidate Analytics</w:t>
+        <w:t>Review</w:t>
+      </w:r>
+      <w:r>
+        <w:rPr>
+          <w:b/>
+          <w:bCs/>
+          <w:color w:val="EE0000"/>
+        </w:rPr>
+        <w:t>ed</w:t>
+      </w:r>
+      <w:r>
+        <w:rPr>
+          <w:b/>
+          <w:bCs/>
+          <w:color w:val="EE0000"/>
+        </w:rPr>
+        <w:t xml:space="preserve"> by</w:t>
+      </w:r>
+      <w:r>
+        <w:rPr>
+          <w:b/>
+          <w:bCs/>
+          <w:color w:val="EE0000"/>
+        </w:rPr>
+        <w:t xml:space="preserve"> Wesley</w:t>
       </w:r>
     </w:p>
     <w:p>
@@ -759,26 +1045,59 @@
         </w:numPr>
       </w:pPr>
       <w:r>
-        <w:rPr>
-          <w:strike/>
+        <w:t xml:space="preserve">El Table 1.13.3 </w:t>
+      </w:r>
+      <w:r>
+        <w:t>— Profile and Resume Engagement</w:t>
+      </w:r>
+      <w:r>
+        <w:t xml:space="preserve"> - </w:t>
+      </w:r>
+      <w:r>
+        <w:rPr>
+          <w:b/>
+          <w:bCs/>
+        </w:rPr>
+        <w:t>William</w:t>
+      </w:r>
+      <w:r>
+        <w:rPr>
+          <w:b/>
+          <w:bCs/>
+        </w:rPr>
+        <w:t xml:space="preserve">– </w:t>
+      </w:r>
+      <w:r>
+        <w:rPr>
+          <w:b/>
+          <w:bCs/>
           <w:color w:val="EE0000"/>
         </w:rPr>
-        <w:t>EI Table 1.12.3</w:t>
-      </w:r>
-      <w:r>
-        <w:t xml:space="preserve"> </w:t>
-      </w:r>
-      <w:r>
-        <w:t>El Table 1.13.</w:t>
-      </w:r>
-      <w:r>
-        <w:t>3</w:t>
-      </w:r>
-      <w:r>
-        <w:t xml:space="preserve"> </w:t>
-      </w:r>
-      <w:r>
-        <w:t>— Profile and Resume Engagement</w:t>
+        <w:t>Review</w:t>
+      </w:r>
+      <w:r>
+        <w:rPr>
+          <w:b/>
+          <w:bCs/>
+          <w:color w:val="EE0000"/>
+        </w:rPr>
+        <w:t>ed</w:t>
+      </w:r>
+      <w:r>
+        <w:rPr>
+          <w:b/>
+          <w:bCs/>
+          <w:color w:val="EE0000"/>
+        </w:rPr>
+        <w:t xml:space="preserve"> by</w:t>
+      </w:r>
+      <w:r>
+        <w:rPr>
+          <w:b/>
+          <w:bCs/>
+          <w:color w:val="EE0000"/>
+        </w:rPr>
+        <w:t xml:space="preserve"> Adam</w:t>
       </w:r>
     </w:p>
     <w:p>
@@ -790,26 +1109,66 @@
         </w:numPr>
       </w:pPr>
       <w:r>
-        <w:rPr>
-          <w:strike/>
+        <w:t xml:space="preserve">El Table 1.13.4 </w:t>
+      </w:r>
+      <w:r>
+        <w:t>— Notification and News Feed Analytics</w:t>
+      </w:r>
+      <w:r>
+        <w:t xml:space="preserve"> – </w:t>
+      </w:r>
+      <w:r>
+        <w:rPr>
+          <w:b/>
+          <w:bCs/>
+        </w:rPr>
+        <w:t>Ethan S.</w:t>
+      </w:r>
+      <w:r>
+        <w:rPr>
+          <w:b/>
+          <w:bCs/>
+        </w:rPr>
+        <w:t xml:space="preserve"> </w:t>
+      </w:r>
+      <w:r>
+        <w:rPr>
+          <w:b/>
+          <w:bCs/>
+        </w:rPr>
+        <w:t xml:space="preserve">– </w:t>
+      </w:r>
+      <w:r>
+        <w:rPr>
+          <w:b/>
+          <w:bCs/>
           <w:color w:val="EE0000"/>
         </w:rPr>
-        <w:t>EI Table 1.12.4</w:t>
-      </w:r>
-      <w:r>
-        <w:t xml:space="preserve"> </w:t>
-      </w:r>
-      <w:r>
-        <w:t>El Table 1.13.</w:t>
-      </w:r>
-      <w:r>
-        <w:t>4</w:t>
-      </w:r>
-      <w:r>
-        <w:t xml:space="preserve"> </w:t>
-      </w:r>
-      <w:r>
-        <w:t>— Notification and News Feed Analytics</w:t>
+        <w:t>Review</w:t>
+      </w:r>
+      <w:r>
+        <w:rPr>
+          <w:b/>
+          <w:bCs/>
+          <w:color w:val="EE0000"/>
+        </w:rPr>
+        <w:t>ed</w:t>
+      </w:r>
+      <w:r>
+        <w:rPr>
+          <w:b/>
+          <w:bCs/>
+          <w:color w:val="EE0000"/>
+        </w:rPr>
+        <w:t xml:space="preserve"> by</w:t>
+      </w:r>
+      <w:r>
+        <w:rPr>
+          <w:b/>
+          <w:bCs/>
+          <w:color w:val="EE0000"/>
+        </w:rPr>
+        <w:t xml:space="preserve"> Dallin</w:t>
       </w:r>
     </w:p>
     <w:p>
@@ -821,26 +1180,59 @@
         </w:numPr>
       </w:pPr>
       <w:r>
-        <w:rPr>
-          <w:strike/>
+        <w:t xml:space="preserve">El Table 1.13.5 </w:t>
+      </w:r>
+      <w:r>
+        <w:t>— Performance Monitor</w:t>
+      </w:r>
+      <w:r>
+        <w:t xml:space="preserve"> - </w:t>
+      </w:r>
+      <w:r>
+        <w:rPr>
+          <w:b/>
+          <w:bCs/>
+        </w:rPr>
+        <w:t>Adam</w:t>
+      </w:r>
+      <w:r>
+        <w:rPr>
+          <w:b/>
+          <w:bCs/>
+        </w:rPr>
+        <w:t xml:space="preserve">– </w:t>
+      </w:r>
+      <w:r>
+        <w:rPr>
+          <w:b/>
+          <w:bCs/>
           <w:color w:val="EE0000"/>
         </w:rPr>
-        <w:t>EI Table 1.12.5</w:t>
-      </w:r>
-      <w:r>
-        <w:t xml:space="preserve"> </w:t>
-      </w:r>
-      <w:r>
-        <w:t>El Table 1.13.</w:t>
-      </w:r>
-      <w:r>
-        <w:t>5</w:t>
-      </w:r>
-      <w:r>
-        <w:t xml:space="preserve"> </w:t>
-      </w:r>
-      <w:r>
-        <w:t>— Performance Monitor</w:t>
+        <w:t>Review</w:t>
+      </w:r>
+      <w:r>
+        <w:rPr>
+          <w:b/>
+          <w:bCs/>
+          <w:color w:val="EE0000"/>
+        </w:rPr>
+        <w:t>ed</w:t>
+      </w:r>
+      <w:r>
+        <w:rPr>
+          <w:b/>
+          <w:bCs/>
+          <w:color w:val="EE0000"/>
+        </w:rPr>
+        <w:t xml:space="preserve"> by</w:t>
+      </w:r>
+      <w:r>
+        <w:rPr>
+          <w:b/>
+          <w:bCs/>
+          <w:color w:val="EE0000"/>
+        </w:rPr>
+        <w:t xml:space="preserve"> Ethan S.</w:t>
       </w:r>
     </w:p>
     <w:p/>
@@ -903,10 +1295,7 @@
         <w:ind w:left="0"/>
       </w:pPr>
       <w:r>
-        <w:t>EI Table 1.4.11 — External Services Orchestrator</w:t>
-      </w:r>
-      <w:r>
-        <w:t xml:space="preserve">: </w:t>
+        <w:t xml:space="preserve">EI Table 1.4.11 — External Services Orchestrator: </w:t>
       </w:r>
     </w:p>
     <w:p>
@@ -2022,28 +2411,7 @@
           <w:b/>
           <w:bCs/>
         </w:rPr>
-        <w:t>Table 1.</w:t>
-      </w:r>
-      <w:r>
-        <w:rPr>
-          <w:b/>
-          <w:bCs/>
-        </w:rPr>
-        <w:t>12</w:t>
-      </w:r>
-      <w:r>
-        <w:rPr>
-          <w:b/>
-          <w:bCs/>
-        </w:rPr>
-        <w:t>.1</w:t>
-      </w:r>
-      <w:r>
-        <w:rPr>
-          <w:b/>
-          <w:bCs/>
-        </w:rPr>
-        <w:t xml:space="preserve">, Table 1.12.2, &amp; Table 1.12.3: </w:t>
+        <w:t xml:space="preserve">Table 1.12.1, Table 1.12.2, &amp; Table 1.12.3: </w:t>
       </w:r>
       <w:r>
         <w:t>s</w:t>
@@ -2865,63 +3233,7 @@
           <w:b/>
           <w:bCs/>
         </w:rPr>
-        <w:t>Table 1.1</w:t>
-      </w:r>
-      <w:r>
-        <w:rPr>
-          <w:b/>
-          <w:bCs/>
-        </w:rPr>
-        <w:t>3</w:t>
-      </w:r>
-      <w:r>
-        <w:rPr>
-          <w:b/>
-          <w:bCs/>
-        </w:rPr>
-        <w:t>.1, Table 1.1</w:t>
-      </w:r>
-      <w:r>
-        <w:rPr>
-          <w:b/>
-          <w:bCs/>
-        </w:rPr>
-        <w:t>3</w:t>
-      </w:r>
-      <w:r>
-        <w:rPr>
-          <w:b/>
-          <w:bCs/>
-        </w:rPr>
-        <w:t>.2, Table 1.1</w:t>
-      </w:r>
-      <w:r>
-        <w:rPr>
-          <w:b/>
-          <w:bCs/>
-        </w:rPr>
-        <w:t>3</w:t>
-      </w:r>
-      <w:r>
-        <w:rPr>
-          <w:b/>
-          <w:bCs/>
-        </w:rPr>
-        <w:t>.3</w:t>
-      </w:r>
-      <w:r>
-        <w:rPr>
-          <w:b/>
-          <w:bCs/>
-        </w:rPr>
-        <w:t>, Table 1.13.4, Table 1.13.5</w:t>
-      </w:r>
-      <w:r>
-        <w:rPr>
-          <w:b/>
-          <w:bCs/>
-        </w:rPr>
-        <w:t xml:space="preserve">: </w:t>
+        <w:t xml:space="preserve">Table 1.13.1, Table 1.13.2, Table 1.13.3, Table 1.13.4, Table 1.13.5: </w:t>
       </w:r>
       <w:r>
         <w:t>s</w:t>
@@ -2930,10 +3242,7 @@
         <w:t xml:space="preserve">ee page </w:t>
       </w:r>
       <w:r>
-        <w:t>2</w:t>
-      </w:r>
-      <w:r>
-        <w:t>5</w:t>
+        <w:t>25</w:t>
       </w:r>
       <w:r>
         <w:t xml:space="preserve"> </w:t>

</xml_diff>